<commit_message>
Add course-report supplements, Task4 & paper-talk decks, regenerated artifacts
- Supplementary analyses: bias-variance learning curve, top-k ablation,
  calibration curve, and rule-baseline comparison (scripts + figures + tables)
- Task4 slide deck + speaker script (VI); paper-talk decks (EN/VI) + script
- Course-requirements report BAO_CAO_THEO_MON_DSP391m_VI (md + docx)
- ARCHITECTURE.md and PROJECT_STATUS.md project overviews
- Regenerate docs (EN/VI docx), paper (tex/pdf/docx), figures, tables

Co-Authored-By: Claude Opus 4.8 (1M context) <noreply@anthropic.com>
</commit_message>
<xml_diff>
--- a/docs/01_data_specification/Target_Variable_Definition_EN.docx
+++ b/docs/01_data_specification/Target_Variable_Definition_EN.docx
@@ -447,16 +447,88 @@
       </w:pPr>
       <w:r>
         <w:rPr>
-          <w:rStyle w:val="VerbatimChar"/>
-        </w:rPr>
-        <w:t xml:space="preserve">df["at_risk"] = df["final_result"].isin(["Fail", "Withdrawn"]).astype(int)</w:t>
+          <w:rStyle w:val="NormalTok"/>
+        </w:rPr>
+        <w:t xml:space="preserve">df[</w:t>
+      </w:r>
+      <w:r>
+        <w:rPr>
+          <w:rStyle w:val="StringTok"/>
+        </w:rPr>
+        <w:t xml:space="preserve">"at_risk"</w:t>
+      </w:r>
+      <w:r>
+        <w:rPr>
+          <w:rStyle w:val="NormalTok"/>
+        </w:rPr>
+        <w:t xml:space="preserve">] </w:t>
+      </w:r>
+      <w:r>
+        <w:rPr>
+          <w:rStyle w:val="OperatorTok"/>
+        </w:rPr>
+        <w:t xml:space="preserve">=</w:t>
+      </w:r>
+      <w:r>
+        <w:rPr>
+          <w:rStyle w:val="NormalTok"/>
+        </w:rPr>
+        <w:t xml:space="preserve"> df[</w:t>
+      </w:r>
+      <w:r>
+        <w:rPr>
+          <w:rStyle w:val="StringTok"/>
+        </w:rPr>
+        <w:t xml:space="preserve">"final_result"</w:t>
+      </w:r>
+      <w:r>
+        <w:rPr>
+          <w:rStyle w:val="NormalTok"/>
+        </w:rPr>
+        <w:t xml:space="preserve">].isin([</w:t>
+      </w:r>
+      <w:r>
+        <w:rPr>
+          <w:rStyle w:val="StringTok"/>
+        </w:rPr>
+        <w:t xml:space="preserve">"Fail"</w:t>
+      </w:r>
+      <w:r>
+        <w:rPr>
+          <w:rStyle w:val="NormalTok"/>
+        </w:rPr>
+        <w:t xml:space="preserve">, </w:t>
+      </w:r>
+      <w:r>
+        <w:rPr>
+          <w:rStyle w:val="StringTok"/>
+        </w:rPr>
+        <w:t xml:space="preserve">"Withdrawn"</w:t>
+      </w:r>
+      <w:r>
+        <w:rPr>
+          <w:rStyle w:val="NormalTok"/>
+        </w:rPr>
+        <w:t xml:space="preserve">]).astype(</w:t>
+      </w:r>
+      <w:r>
+        <w:rPr>
+          <w:rStyle w:val="BuiltInTok"/>
+        </w:rPr>
+        <w:t xml:space="preserve">int</w:t>
+      </w:r>
+      <w:r>
+        <w:rPr>
+          <w:rStyle w:val="NormalTok"/>
+        </w:rPr>
+        <w:t xml:space="preserve">)</w:t>
       </w:r>
       <w:r>
         <w:br/>
       </w:r>
       <w:r>
         <w:rPr>
-          <w:rStyle w:val="VerbatimChar"/>
+          <w:rStyle w:val="CommentTok"/>
         </w:rPr>
         <w:t xml:space="preserve"># 1 = at-risk (positive class to detect); 0 = not-at-risk</w:t>
       </w:r>

</xml_diff>